<commit_message>
Correct the two copy-request entries.
</commit_message>
<xml_diff>
--- a/Caste_Certificate_Correction_Notesheet_New.docx
+++ b/Caste_Certificate_Correction_Notesheet_New.docx
@@ -1016,7 +1016,7 @@
           <w:color w:val="000000"/>
           <w:sz w:val="24"/>
         </w:rPr>
-        <w:t xml:space="preserve"> of Dist.- Dakshin Dinajpur, the application being by left thumb impression has been received vide Docket No. not marked on the face dt. 19-05-2026 against his caste certificate </w:t>
+        <w:t xml:space="preserve"> of Dist.- Dakshin Dinajpur has been received. The application is dated 19-05-2026 and is signed by left thumb impression. No docket number is marked on the face. </w:t>
       </w:r>
       <w:r>
         <w:rPr>
@@ -1025,25 +1025,7 @@
           <w:color w:val="000000"/>
           <w:sz w:val="24"/>
         </w:rPr>
-        <w:t>Correction</w:t>
-      </w:r>
-      <w:r>
-        <w:rPr>
-          <w:rFonts w:ascii="Bookman Old Style" w:hAnsi="Bookman Old Style" w:cs="Bookman Old Style" w:eastAsia="Bookman Old Style"/>
-          <w:b w:val="0"/>
-          <w:color w:val="000000"/>
-          <w:sz w:val="24"/>
-        </w:rPr>
-        <w:t xml:space="preserve">. The certificate referred to is No. WB0501ST201900655. This number is already in the earlier correction note of Arup Mahato. </w:t>
-      </w:r>
-      <w:r>
-        <w:rPr>
-          <w:rFonts w:ascii="Bookman Old Style" w:hAnsi="Bookman Old Style" w:cs="Bookman Old Style" w:eastAsia="Bookman Old Style"/>
-          <w:b/>
-          <w:color w:val="000000"/>
-          <w:sz w:val="24"/>
-        </w:rPr>
-        <w:t>This application prays for a xerox copy of the said caste certificate. It is not a fresh prayer for change of spelling.</w:t>
+        <w:t>The prayer is for a xerox copy of Caste Certificate No. WB0501ST201900655. It is not a fresh prayer for change of spelling. This certificate number is already in the earlier correction note of Arup Mahato.</w:t>
       </w:r>
     </w:p>
     <w:p>
@@ -1238,7 +1220,7 @@
           <w:color w:val="000000"/>
           <w:sz w:val="24"/>
         </w:rPr>
-        <w:t xml:space="preserve">III) One No. of application from </w:t>
+        <w:t xml:space="preserve">III) One No. of application, the name being signed in Bengali, addressed to the Block Development Officer, Hili Development Block, has been received in this office vide Docket No. 5185 dt. 14-11-2024. The letter is dated 11-11-2024. </w:t>
       </w:r>
       <w:r>
         <w:rPr>
@@ -1247,43 +1229,7 @@
           <w:color w:val="000000"/>
           <w:sz w:val="24"/>
         </w:rPr>
-        <w:t>The applicant, name signed in Bengali</w:t>
-      </w:r>
-      <w:r>
-        <w:rPr>
-          <w:rFonts w:ascii="Bookman Old Style" w:hAnsi="Bookman Old Style" w:cs="Bookman Old Style" w:eastAsia="Bookman Old Style"/>
-          <w:b w:val="0"/>
-          <w:color w:val="000000"/>
-          <w:sz w:val="24"/>
-        </w:rPr>
-        <w:t xml:space="preserve"> of the letter being addressed to the Block Development Officer, Hili Development Block, and received in this office has been received vide Docket No. 5185 dt. 14-11-2024 against the caste certificate </w:t>
-      </w:r>
-      <w:r>
-        <w:rPr>
-          <w:rFonts w:ascii="Bookman Old Style" w:hAnsi="Bookman Old Style" w:cs="Bookman Old Style" w:eastAsia="Bookman Old Style"/>
-          <w:b/>
-          <w:color w:val="000000"/>
-          <w:sz w:val="24"/>
-        </w:rPr>
-        <w:t>Correction</w:t>
-      </w:r>
-      <w:r>
-        <w:rPr>
-          <w:rFonts w:ascii="Bookman Old Style" w:hAnsi="Bookman Old Style" w:cs="Bookman Old Style" w:eastAsia="Bookman Old Style"/>
-          <w:b w:val="0"/>
-          <w:color w:val="000000"/>
-          <w:sz w:val="24"/>
-        </w:rPr>
-        <w:t xml:space="preserve">. The letter is dated 11-11-2024. ST Certificate ID No. STWB05012021/53105 dt. 09-09-2021. </w:t>
-      </w:r>
-      <w:r>
-        <w:rPr>
-          <w:rFonts w:ascii="Bookman Old Style" w:hAnsi="Bookman Old Style" w:cs="Bookman Old Style" w:eastAsia="Bookman Old Style"/>
-          <w:b/>
-          <w:color w:val="000000"/>
-          <w:sz w:val="24"/>
-        </w:rPr>
-        <w:t>The prayer is for a copy of the ST certificate, and not for correction of a name.</w:t>
+        <w:t>The prayer is for a copy of ST Certificate ID No. STWB05012021/53105 dt. 09-09-2021, and not for correction of a name.</w:t>
       </w:r>
     </w:p>
     <w:p>

</xml_diff>